<commit_message>
feat: DOCX 导出管线 — prepareDocxData + renderDocx + IPC handler + ToolPanel 按钮
- src/main/ipc/docx.ts: calcAge / prepareDocxData / renderDocx
  - 本人+家属年龄从出生日期+JiSuanNianLingShiJian 运算
  - JiaTingChengYuan.Item 拍平到根层 Item，丢弃 ChuShengRiQi
  - 跳过 ShenFenZheng（纸质表格无此栏）
- IPC handler export-docx 注册，preload 暴露 exportDocx
- ToolPanel 新增导出 DOCX / 导出 PDF 按钮
- EditorLayout 连线 handleExportDocx 回调
- templates/output.docx 更新：循环标签/年龄标签/简历缩进/fitText
</commit_message>
<xml_diff>
--- a/templates/output.docx
+++ b/templates/output.docx
@@ -390,6 +390,7 @@
                 <w:rFonts w:hint="eastAsia"/>
                 <w:szCs w:val="28"/>
               </w:rPr>
+              <w:fitText w:val="true"/>
             </w:pPr>
             <w:bookmarkStart w:id="0" w:name="A0101_1"/>
             <w:bookmarkEnd w:id="0"/>
@@ -555,6 +556,13 @@
                 <w:szCs w:val="28"/>
               </w:rPr>
               <w:t>{ChuShengNianYue}</w:t>
+            </w:r>
+            <w:r>
+              <w:rPr>
+                <w:rFonts w:hint="eastAsia"/>
+                <w:szCs w:val="28"/>
+              </w:rPr>
+              <w:t>（{NianLing}岁）</w:t>
             </w:r>
           </w:p>
           <w:p>
@@ -2309,7 +2317,7 @@
             <w:pPr>
               <w:pStyle w:val="Normal"/>
               <w:spacing w:lineRule="exact" w:line="320" w:before="60" w:after="0"/>
-              <w:ind w:hanging="2530" w:start="2710" w:end="100"/>
+              <w:ind w:hanging="0" w:start="113" w:end="113"/>
               <w:rPr>
                 <w:rFonts w:hint="eastAsia"/>
               </w:rPr>
@@ -3200,7 +3208,7 @@
                 <w:sz w:val="24"/>
                 <w:szCs w:val="28"/>
               </w:rPr>
-              <w:t>{ChengWei}</w:t>
+              <w:t>{#Item} {ChengWei}</w:t>
             </w:r>
           </w:p>
         </w:tc>
@@ -3224,6 +3232,7 @@
               <w:rPr>
                 <w:szCs w:val="28"/>
               </w:rPr>
+              <w:fitText w:val="true"/>
             </w:pPr>
             <w:r>
               <w:rPr>
@@ -3257,6 +3266,7 @@
               <w:rPr>
                 <w:szCs w:val="28"/>
               </w:rPr>
+              <w:t>{NianLing}</w:t>
             </w:r>
           </w:p>
         </w:tc>
@@ -3313,7 +3323,7 @@
               <w:rPr>
                 <w:szCs w:val="28"/>
               </w:rPr>
-              <w:t>{GongZuoDanWeiJiZhiWu}</w:t>
+              <w:t>{GongZuoDanWeiJiZhiWu} {/Item}</w:t>
             </w:r>
           </w:p>
         </w:tc>

</xml_diff>